<commit_message>
Templates: update "Employee Signature"
</commit_message>
<xml_diff>
--- a/public/templates/Payment_receipt.docx
+++ b/public/templates/Payment_receipt.docx
@@ -28,7 +28,6 @@
         </w:rPr>
         <w:br/>
       </w:r>
-      <w:proofErr w:type="spellStart"/>
       <w:r>
         <w:rPr>
           <w:rFonts w:ascii="Browallia New" w:eastAsia="Aptos" w:hAnsi="Browallia New" w:cs="Browallia New"/>
@@ -38,7 +37,6 @@
         </w:rPr>
         <w:t>ใบสำคัญรับเงิน</w:t>
       </w:r>
-      <w:proofErr w:type="spellEnd"/>
     </w:p>
     <w:p>
       <w:pPr>
@@ -73,7 +71,6 @@
         </w:rPr>
         <w:t xml:space="preserve">Date / </w:t>
       </w:r>
-      <w:proofErr w:type="spellStart"/>
       <w:r>
         <w:rPr>
           <w:rFonts w:ascii="Browallia New" w:eastAsia="Aptos" w:hAnsi="Browallia New" w:cs="Browallia New"/>
@@ -84,7 +81,6 @@
         </w:rPr>
         <w:t>วันที่</w:t>
       </w:r>
-      <w:proofErr w:type="spellEnd"/>
       <w:r>
         <w:rPr>
           <w:rFonts w:ascii="Aptos" w:eastAsia="Aptos" w:hAnsi="Aptos" w:cs="Aptos"/>
@@ -125,7 +121,6 @@
         </w:rPr>
         <w:t xml:space="preserve">Company / </w:t>
       </w:r>
-      <w:proofErr w:type="spellStart"/>
       <w:r>
         <w:rPr>
           <w:rFonts w:ascii="Browallia New" w:eastAsia="Aptos" w:hAnsi="Browallia New" w:cs="Browallia New"/>
@@ -136,7 +131,6 @@
         </w:rPr>
         <w:t>ชื่อบริษัท</w:t>
       </w:r>
-      <w:proofErr w:type="spellEnd"/>
       <w:r>
         <w:rPr>
           <w:rFonts w:ascii="Aptos" w:eastAsia="Aptos" w:hAnsi="Aptos" w:cs="Aptos"/>
@@ -175,7 +169,6 @@
         </w:rPr>
         <w:t xml:space="preserve">Branch / </w:t>
       </w:r>
-      <w:proofErr w:type="spellStart"/>
       <w:r>
         <w:rPr>
           <w:rFonts w:ascii="Browallia New" w:eastAsia="Aptos" w:hAnsi="Browallia New" w:cs="Browallia New"/>
@@ -186,7 +179,6 @@
         </w:rPr>
         <w:t>สาขา</w:t>
       </w:r>
-      <w:proofErr w:type="spellEnd"/>
       <w:r>
         <w:rPr>
           <w:rFonts w:ascii="Aptos" w:eastAsia="Aptos" w:hAnsi="Aptos" w:cs="Aptos"/>
@@ -237,7 +229,6 @@
         </w:rPr>
         <w:t xml:space="preserve">Received from / </w:t>
       </w:r>
-      <w:proofErr w:type="spellStart"/>
       <w:r>
         <w:rPr>
           <w:rFonts w:ascii="Browallia New" w:eastAsia="Aptos" w:hAnsi="Browallia New" w:cs="Browallia New"/>
@@ -248,7 +239,6 @@
         </w:rPr>
         <w:t>ได้รับเงินจาก</w:t>
       </w:r>
-      <w:proofErr w:type="spellEnd"/>
       <w:r>
         <w:rPr>
           <w:rFonts w:ascii="Aptos" w:eastAsia="Aptos" w:hAnsi="Aptos" w:cs="Aptos"/>
@@ -289,7 +279,6 @@
         </w:rPr>
         <w:t xml:space="preserve">Payment to / </w:t>
       </w:r>
-      <w:proofErr w:type="spellStart"/>
       <w:r>
         <w:rPr>
           <w:rFonts w:ascii="Browallia New" w:eastAsia="Aptos" w:hAnsi="Browallia New" w:cs="Browallia New"/>
@@ -300,7 +289,6 @@
         </w:rPr>
         <w:t>จ่ายให้แก่</w:t>
       </w:r>
-      <w:proofErr w:type="spellEnd"/>
       <w:r>
         <w:rPr>
           <w:rFonts w:ascii="Aptos" w:eastAsia="Aptos" w:hAnsi="Aptos" w:cs="Aptos"/>
@@ -341,7 +329,6 @@
         </w:rPr>
         <w:t xml:space="preserve">Job Title / </w:t>
       </w:r>
-      <w:proofErr w:type="spellStart"/>
       <w:r>
         <w:rPr>
           <w:rFonts w:ascii="Browallia New" w:eastAsia="Aptos" w:hAnsi="Browallia New" w:cs="Browallia New"/>
@@ -352,7 +339,6 @@
         </w:rPr>
         <w:t>ตำแหน่ง</w:t>
       </w:r>
-      <w:proofErr w:type="spellEnd"/>
       <w:r>
         <w:rPr>
           <w:rFonts w:ascii="Aptos" w:eastAsia="Aptos" w:hAnsi="Aptos" w:cs="Aptos"/>
@@ -383,7 +369,6 @@
         </w:rPr>
         <w:t xml:space="preserve">ID / Passport No. / </w:t>
       </w:r>
-      <w:proofErr w:type="spellStart"/>
       <w:r>
         <w:rPr>
           <w:rFonts w:ascii="Browallia New" w:eastAsia="Aptos" w:hAnsi="Browallia New" w:cs="Browallia New"/>
@@ -394,7 +379,6 @@
         </w:rPr>
         <w:t>หมายเลขบัตรประชาชน</w:t>
       </w:r>
-      <w:proofErr w:type="spellEnd"/>
       <w:r>
         <w:rPr>
           <w:rFonts w:ascii="Aptos" w:eastAsia="Aptos" w:hAnsi="Aptos" w:cs="Aptos"/>
@@ -405,7 +389,6 @@
         </w:rPr>
         <w:t>/</w:t>
       </w:r>
-      <w:proofErr w:type="spellStart"/>
       <w:r>
         <w:rPr>
           <w:rFonts w:ascii="Browallia New" w:eastAsia="Aptos" w:hAnsi="Browallia New" w:cs="Browallia New"/>
@@ -416,7 +399,6 @@
         </w:rPr>
         <w:t>พาสปอร์ต</w:t>
       </w:r>
-      <w:proofErr w:type="spellEnd"/>
       <w:r>
         <w:rPr>
           <w:rFonts w:ascii="Aptos" w:eastAsia="Aptos" w:hAnsi="Aptos" w:cs="Aptos"/>
@@ -469,7 +451,6 @@
         </w:rPr>
         <w:t xml:space="preserve">Payment Method / </w:t>
       </w:r>
-      <w:proofErr w:type="spellStart"/>
       <w:r>
         <w:rPr>
           <w:rFonts w:ascii="Browallia New" w:eastAsia="Aptos" w:hAnsi="Browallia New" w:cs="Browallia New"/>
@@ -480,7 +461,6 @@
         </w:rPr>
         <w:t>วิธีการชำระเงิน</w:t>
       </w:r>
-      <w:proofErr w:type="spellEnd"/>
       <w:r>
         <w:rPr>
           <w:rFonts w:ascii="Aptos" w:eastAsia="Aptos" w:hAnsi="Aptos" w:cs="Aptos"/>
@@ -515,16 +495,7 @@
           <w:sz w:val="24"/>
           <w:szCs w:val="24"/>
         </w:rPr>
-        <w:t>{{#IS_BANK</w:t>
-      </w:r>
-      <w:proofErr w:type="gramStart"/>
-      <w:r>
-        <w:rPr>
-          <w:rFonts w:ascii="Aptos" w:eastAsia="Aptos" w:hAnsi="Aptos" w:cs="Aptos"/>
-          <w:sz w:val="24"/>
-          <w:szCs w:val="24"/>
-        </w:rPr>
-        <w:t>}}</w:t>
+        <w:t>{{#IS_BANK}}</w:t>
       </w:r>
       <w:r>
         <w:rPr>
@@ -534,9 +505,18 @@
           <w:sz w:val="24"/>
           <w:szCs w:val="24"/>
         </w:rPr>
-        <w:t>Account</w:t>
+        <w:t xml:space="preserve">Account / </w:t>
       </w:r>
-      <w:proofErr w:type="gramEnd"/>
+      <w:r>
+        <w:rPr>
+          <w:rFonts w:ascii="Browallia New" w:eastAsia="Aptos" w:hAnsi="Browallia New" w:cs="Browallia New"/>
+          <w:b/>
+          <w:bCs/>
+          <w:sz w:val="24"/>
+          <w:szCs w:val="24"/>
+        </w:rPr>
+        <w:t>บัญชี</w:t>
+      </w:r>
       <w:r>
         <w:rPr>
           <w:rFonts w:ascii="Aptos" w:eastAsia="Aptos" w:hAnsi="Aptos" w:cs="Aptos"/>
@@ -545,9 +525,50 @@
           <w:sz w:val="24"/>
           <w:szCs w:val="24"/>
         </w:rPr>
-        <w:t xml:space="preserve"> / </w:t>
+        <w:t xml:space="preserve">: </w:t>
       </w:r>
-      <w:proofErr w:type="spellStart"/>
+      <w:r>
+        <w:rPr>
+          <w:rFonts w:ascii="Aptos" w:eastAsia="Aptos" w:hAnsi="Aptos" w:cs="Aptos"/>
+          <w:sz w:val="24"/>
+          <w:szCs w:val="24"/>
+        </w:rPr>
+        <w:t>{{BANK_ACCOUNT}}{{/IS_BANK}}</w:t>
+      </w:r>
+    </w:p>
+    <w:p>
+      <w:pPr>
+        <w:spacing w:line="276" w:lineRule="auto"/>
+        <w:rPr>
+          <w:rFonts w:ascii="Aptos" w:eastAsia="Aptos" w:hAnsi="Aptos" w:cs="Aptos"/>
+          <w:b/>
+          <w:bCs/>
+          <w:sz w:val="24"/>
+          <w:szCs w:val="24"/>
+        </w:rPr>
+      </w:pPr>
+    </w:p>
+    <w:p>
+      <w:pPr>
+        <w:spacing w:line="276" w:lineRule="auto"/>
+        <w:rPr>
+          <w:rFonts w:ascii="Aptos" w:eastAsia="Aptos" w:hAnsi="Aptos" w:cs="Aptos"/>
+          <w:b/>
+          <w:bCs/>
+          <w:sz w:val="24"/>
+          <w:szCs w:val="24"/>
+        </w:rPr>
+      </w:pPr>
+      <w:r>
+        <w:rPr>
+          <w:rFonts w:ascii="Aptos" w:eastAsia="Aptos" w:hAnsi="Aptos" w:cs="Aptos"/>
+          <w:b/>
+          <w:bCs/>
+          <w:sz w:val="24"/>
+          <w:szCs w:val="24"/>
+        </w:rPr>
+        <w:t xml:space="preserve">For the pay period of / </w:t>
+      </w:r>
       <w:r>
         <w:rPr>
           <w:rFonts w:ascii="Browallia New" w:eastAsia="Aptos" w:hAnsi="Browallia New" w:cs="Browallia New"/>
@@ -556,91 +577,8 @@
           <w:sz w:val="24"/>
           <w:szCs w:val="24"/>
         </w:rPr>
-        <w:t>บัญชี</w:t>
-      </w:r>
-      <w:proofErr w:type="spellEnd"/>
-      <w:r>
-        <w:rPr>
-          <w:rFonts w:ascii="Aptos" w:eastAsia="Aptos" w:hAnsi="Aptos" w:cs="Aptos"/>
-          <w:b/>
-          <w:bCs/>
-          <w:sz w:val="24"/>
-          <w:szCs w:val="24"/>
-        </w:rPr>
-        <w:t xml:space="preserve">: </w:t>
-      </w:r>
-      <w:r>
-        <w:rPr>
-          <w:rFonts w:ascii="Aptos" w:eastAsia="Aptos" w:hAnsi="Aptos" w:cs="Aptos"/>
-          <w:sz w:val="24"/>
-          <w:szCs w:val="24"/>
-        </w:rPr>
-        <w:t>{{BANK_ACCOUNT</w:t>
-      </w:r>
-      <w:proofErr w:type="gramStart"/>
-      <w:r>
-        <w:rPr>
-          <w:rFonts w:ascii="Aptos" w:eastAsia="Aptos" w:hAnsi="Aptos" w:cs="Aptos"/>
-          <w:sz w:val="24"/>
-          <w:szCs w:val="24"/>
-        </w:rPr>
-        <w:t>}}{</w:t>
-      </w:r>
-      <w:proofErr w:type="gramEnd"/>
-      <w:r>
-        <w:rPr>
-          <w:rFonts w:ascii="Aptos" w:eastAsia="Aptos" w:hAnsi="Aptos" w:cs="Aptos"/>
-          <w:sz w:val="24"/>
-          <w:szCs w:val="24"/>
-        </w:rPr>
-        <w:t>{/IS_BANK}}</w:t>
-      </w:r>
-    </w:p>
-    <w:p>
-      <w:pPr>
-        <w:spacing w:line="276" w:lineRule="auto"/>
-        <w:rPr>
-          <w:rFonts w:ascii="Aptos" w:eastAsia="Aptos" w:hAnsi="Aptos" w:cs="Aptos"/>
-          <w:b/>
-          <w:bCs/>
-          <w:sz w:val="24"/>
-          <w:szCs w:val="24"/>
-        </w:rPr>
-      </w:pPr>
-    </w:p>
-    <w:p>
-      <w:pPr>
-        <w:spacing w:line="276" w:lineRule="auto"/>
-        <w:rPr>
-          <w:rFonts w:ascii="Aptos" w:eastAsia="Aptos" w:hAnsi="Aptos" w:cs="Aptos"/>
-          <w:b/>
-          <w:bCs/>
-          <w:sz w:val="24"/>
-          <w:szCs w:val="24"/>
-        </w:rPr>
-      </w:pPr>
-      <w:r>
-        <w:rPr>
-          <w:rFonts w:ascii="Aptos" w:eastAsia="Aptos" w:hAnsi="Aptos" w:cs="Aptos"/>
-          <w:b/>
-          <w:bCs/>
-          <w:sz w:val="24"/>
-          <w:szCs w:val="24"/>
-        </w:rPr>
-        <w:t xml:space="preserve">For the pay period of / </w:t>
-      </w:r>
-      <w:proofErr w:type="spellStart"/>
-      <w:r>
-        <w:rPr>
-          <w:rFonts w:ascii="Browallia New" w:eastAsia="Aptos" w:hAnsi="Browallia New" w:cs="Browallia New"/>
-          <w:b/>
-          <w:bCs/>
-          <w:sz w:val="24"/>
-          <w:szCs w:val="24"/>
-        </w:rPr>
         <w:t>สำหรับงวดการจ่ายเงิน</w:t>
       </w:r>
-      <w:proofErr w:type="spellEnd"/>
       <w:r>
         <w:rPr>
           <w:rFonts w:ascii="Aptos" w:eastAsia="Aptos" w:hAnsi="Aptos" w:cs="Aptos"/>
@@ -693,7 +631,6 @@
         </w:rPr>
         <w:t xml:space="preserve">Net Pay / </w:t>
       </w:r>
-      <w:proofErr w:type="spellStart"/>
       <w:r>
         <w:rPr>
           <w:rFonts w:ascii="Browallia New" w:eastAsia="Aptos" w:hAnsi="Browallia New" w:cs="Browallia New"/>
@@ -704,7 +641,6 @@
         </w:rPr>
         <w:t>จำนวนเงินสุทธิ</w:t>
       </w:r>
-      <w:proofErr w:type="spellEnd"/>
       <w:r>
         <w:rPr>
           <w:rFonts w:ascii="Aptos" w:eastAsia="Aptos" w:hAnsi="Aptos" w:cs="Aptos"/>
@@ -739,18 +675,8 @@
           <w:sz w:val="24"/>
           <w:szCs w:val="24"/>
         </w:rPr>
-        <w:t>({{NET_PAY_WORDS_TH}</w:t>
+        <w:t>({{NET_PAY_WORDS_TH}} )</w:t>
       </w:r>
-      <w:proofErr w:type="gramStart"/>
-      <w:r>
-        <w:rPr>
-          <w:rFonts w:ascii="Aptos" w:eastAsia="Aptos" w:hAnsi="Aptos" w:cs="Aptos"/>
-          <w:sz w:val="24"/>
-          <w:szCs w:val="24"/>
-        </w:rPr>
-        <w:t>} )</w:t>
-      </w:r>
-      <w:proofErr w:type="gramEnd"/>
     </w:p>
     <w:p>
       <w:pPr>
@@ -801,19 +727,8 @@
           <w:sz w:val="24"/>
           <w:szCs w:val="24"/>
         </w:rPr>
-        <w:t>ใบเสร็จรับเงินฉบับนี้เป็นการยืนยันการรับเงินเดือนและรายได้ที่เกี่ยวข้องครบถ้วนสำหรับรอบ</w:t>
+        <w:t>ใบเสร็จรับเงินฉบับนี้เป็นการยืนยันการรับเงินเดือนและรายได้ที่เกี่ยวข้องครบถ้วนสำหรับรอบระยะเวลาที่ระบุไว้</w:t>
       </w:r>
-      <w:proofErr w:type="spellStart"/>
-      <w:r>
-        <w:rPr>
-          <w:rFonts w:ascii="Browallia New" w:eastAsia="Aptos" w:hAnsi="Browallia New" w:cs="Browallia New"/>
-          <w:bCs/>
-          <w:sz w:val="24"/>
-          <w:szCs w:val="24"/>
-        </w:rPr>
-        <w:t>ระยะเวลาที่ระบุไว้</w:t>
-      </w:r>
-      <w:proofErr w:type="spellEnd"/>
     </w:p>
     <w:p>
       <w:pPr>
@@ -868,7 +783,6 @@
               </w:rPr>
               <w:t xml:space="preserve">Employer Signature / </w:t>
             </w:r>
-            <w:proofErr w:type="spellStart"/>
             <w:r>
               <w:rPr>
                 <w:rFonts w:ascii="Browallia New" w:eastAsia="Aptos" w:hAnsi="Browallia New" w:cs="Browallia New"/>
@@ -878,7 +792,6 @@
               </w:rPr>
               <w:t>ลายมือชื่อนายจ้าง</w:t>
             </w:r>
-            <w:proofErr w:type="spellEnd"/>
             <w:r>
               <w:rPr>
                 <w:rFonts w:ascii="Aptos" w:eastAsia="Aptos" w:hAnsi="Aptos" w:cs="Aptos"/>
@@ -953,9 +866,26 @@
                 <w:bCs/>
                 <w:color w:val="1B1C1D"/>
               </w:rPr>
-              <w:t xml:space="preserve">Employer Signature / </w:t>
+              <w:t>Employe</w:t>
             </w:r>
-            <w:proofErr w:type="spellStart"/>
+            <w:r>
+              <w:rPr>
+                <w:rFonts w:ascii="Aptos" w:eastAsia="Aptos" w:hAnsi="Aptos" w:cs="Aptos"/>
+                <w:b/>
+                <w:bCs/>
+                <w:color w:val="1B1C1D"/>
+              </w:rPr>
+              <w:t>e</w:t>
+            </w:r>
+            <w:r>
+              <w:rPr>
+                <w:rFonts w:ascii="Aptos" w:eastAsia="Aptos" w:hAnsi="Aptos" w:cs="Aptos"/>
+                <w:b/>
+                <w:bCs/>
+                <w:color w:val="1B1C1D"/>
+              </w:rPr>
+              <w:t xml:space="preserve"> Signature / </w:t>
+            </w:r>
             <w:r>
               <w:rPr>
                 <w:rFonts w:ascii="Browallia New" w:eastAsia="Aptos" w:hAnsi="Browallia New" w:cs="Browallia New"/>
@@ -965,7 +895,6 @@
               </w:rPr>
               <w:t>ลายมือชื่อนายจ้าง</w:t>
             </w:r>
-            <w:proofErr w:type="spellEnd"/>
             <w:r>
               <w:rPr>
                 <w:rFonts w:ascii="Aptos" w:eastAsia="Aptos" w:hAnsi="Aptos" w:cs="Aptos"/>
@@ -5906,6 +5835,7 @@
   <w:style w:type="character" w:default="1" w:styleId="DefaultParagraphFont">
     <w:name w:val="Default Paragraph Font"/>
     <w:uiPriority w:val="1"/>
+    <w:semiHidden/>
     <w:unhideWhenUsed/>
   </w:style>
   <w:style w:type="table" w:default="1" w:styleId="TableNormal">

</xml_diff>